<commit_message>
docs(informe): reescribir informe con 3 modelos y cifras verificadas
Se enfoca el reporte en OLS, Ridge y Random Forest ganador. Se corrigen las importancias reales (Width 40,3%, Rim 32,1%), las cotizaciones verificadas, la comparacion pareada 5/5 folds y la brecha de sobreajuste con tono sobrio.
</commit_message>
<xml_diff>
--- a/entregables/Desarrollo_de_IA_ev_N3.docx
+++ b/entregables/Desarrollo_de_IA_ev_N3.docx
@@ -26,7 +26,7 @@
     </w:p>
     <w:p>
       <w:pPr>
-        <w:spacing w:before="280" w:after="80"/>
+        <w:spacing w:before="240" w:after="80"/>
         <w:jc w:val="center"/>
       </w:pPr>
       <w:r>
@@ -40,7 +40,7 @@
     </w:p>
     <w:p>
       <w:pPr>
-        <w:spacing w:after="360"/>
+        <w:spacing w:after="320"/>
         <w:jc w:val="center"/>
       </w:pPr>
       <w:r>
@@ -51,7 +51,7 @@
         </w:rPr>
         <w:t>Optimización de Modelos Predictivos y Comparación de Algoritmos</w:t>
         <w:br/>
-        <w:t>Regresión Lineal Múltiple, Regularización L1/L2 y Ensambles</w:t>
+        <w:t>Regresión Lineal Múltiple, Ridge y Random Forest</w:t>
       </w:r>
     </w:p>
     <w:tbl>
@@ -159,149 +159,182 @@
     </w:tbl>
     <w:p>
       <w:pPr>
-        <w:spacing w:after="240"/>
+        <w:spacing w:after="200"/>
       </w:pPr>
     </w:p>
     <w:p>
       <w:pPr>
         <w:keepNext/>
-        <w:spacing w:before="320" w:after="120"/>
+        <w:spacing w:before="280" w:after="80"/>
       </w:pPr>
       <w:r>
         <w:rPr>
           <w:b/>
           <w:color w:val="1B365D"/>
-          <w:sz w:val="28"/>
+          <w:sz w:val="26"/>
         </w:rPr>
         <w:t>1. Resumen Ejecutivo</w:t>
       </w:r>
     </w:p>
     <w:p>
       <w:r>
-        <w:t>En la presente Evidencia de Aprendizaje N.º 3, se completó la optimización de hiperparámetros y la comparación de modelos supervisados para predecir el costo unitario de neumáticos (Unit Cost en INR), tomando como base la Regresión Lineal Múltiple de la Evidencia 2 (Test R² = 0,7968, RMSE = 2.549,50 INR).</w:t>
+        <w:t>En la Evidencia de Aprendizaje N.º 3 se optimizó el modelo predictivo de costo unitario de neumáticos (Unit Cost en INR), tomando como base la Regresión Lineal Múltiple de la Evidencia 2 (Test R² = 0,7968, RMSE = 2.549,50 INR).</w:t>
         <w:br/>
         <w:br/>
-        <w:t>Mediante una estrategia de Validación Cruzada 5-Fold combinada con GridSearchCV sobre pipelines unificados sin fuga de información (data leakage), se contrastaron modelos lineales regularizados (Ridge L2, Lasso L1) frente a familias de ensamble no lineales (Random Forest Regressor y Gradient Boosting Regressor).</w:t>
+        <w:t>Mediante Validación Cruzada 5-Fold y GridSearchCV encapsulados en un ColumnTransformer sin fuga de datos, se compararon tres modelos: Regresión Lineal OLS, Regresión Ridge (L2) y Random Forest Regressor.</w:t>
         <w:br/>
         <w:br/>
-        <w:t xml:space="preserve">El modelo ganador indiscutido fue </w:t>
+        <w:t xml:space="preserve">La selección del modelo se realizó exclusivamente a partir del desempeño en validación cruzada sobre los datos de entrenamiento (Train, N = 200). </w:t>
       </w:r>
       <w:r>
         <w:rPr>
           <w:b/>
         </w:rPr>
-        <w:t>Gradient Boosting Regressor</w:t>
+        <w:t>Random Forest Regressor</w:t>
       </w:r>
       <w:r>
-        <w:t xml:space="preserve">, el cual alcanzó un </w:t>
+        <w:t xml:space="preserve"> resultó el ganador indiscutido:</w:t>
+        <w:br/>
+        <w:t xml:space="preserve">• En Validación Cruzada 5-Fold redujo el RMSE medio a </w:t>
       </w:r>
       <w:r>
         <w:rPr>
           <w:b/>
         </w:rPr>
-        <w:t>Test R² = 0,9223</w:t>
+        <w:t>1.381,01 INR</w:t>
       </w:r>
       <w:r>
-        <w:t xml:space="preserve">, reduciendo el RMSE a </w:t>
+        <w:t xml:space="preserve"> (reducción del 46,67% frente al baseline).</w:t>
+        <w:br/>
+        <w:t xml:space="preserve">• En la comparación pareada fold por fold superó al modelo lineal en </w:t>
       </w:r>
       <w:r>
         <w:rPr>
           <w:b/>
         </w:rPr>
-        <w:t>1.577,13 INR (-38,14%)</w:t>
+        <w:t>5 de los 5 pliegues (100% de victorias)</w:t>
       </w:r>
       <w:r>
-        <w:t xml:space="preserve"> y el MAE a </w:t>
+        <w:t xml:space="preserve">, con una diferencia media a favor de </w:t>
       </w:r>
       <w:r>
         <w:rPr>
           <w:b/>
         </w:rPr>
-        <w:t>975,85 INR (-41,86%)</w:t>
+        <w:t>1.208,3 ± 1.309,1 INR</w:t>
       </w:r>
       <w:r>
-        <w:t>. Esta mejora resulta plenamente significativa tanto estadística como operativamente.</w:t>
+        <w:t>.</w:t>
+        <w:br/>
+        <w:t xml:space="preserve">• En el conjunto Test independiente (N = 51) ratificó la mejora: el RMSE descendió a </w:t>
+      </w:r>
+      <w:r>
+        <w:rPr>
+          <w:b/>
+        </w:rPr>
+        <w:t>2.229,88 INR (+12,54%)</w:t>
+      </w:r>
+      <w:r>
+        <w:t xml:space="preserve">, el MAE cayó a </w:t>
+      </w:r>
+      <w:r>
+        <w:rPr>
+          <w:b/>
+        </w:rPr>
+        <w:t>1.243,18 INR (-25,94%)</w:t>
+      </w:r>
+      <w:r>
+        <w:t xml:space="preserve"> y el R² ascendió a </w:t>
+      </w:r>
+      <w:r>
+        <w:rPr>
+          <w:b/>
+        </w:rPr>
+        <w:t>0,8446</w:t>
+      </w:r>
+      <w:r>
+        <w:t xml:space="preserve"> (+4,78 p.p. netos).</w:t>
       </w:r>
     </w:p>
     <w:p>
       <w:pPr>
         <w:keepNext/>
-        <w:spacing w:before="320" w:after="120"/>
+        <w:spacing w:before="280" w:after="80"/>
       </w:pPr>
       <w:r>
         <w:rPr>
           <w:b/>
           <w:color w:val="1B365D"/>
-          <w:sz w:val="28"/>
+          <w:sz w:val="26"/>
         </w:rPr>
         <w:t>2. Antecedentes y Diagnóstico de Partida (Evidencia 2)</w:t>
       </w:r>
     </w:p>
     <w:p>
       <w:r>
-        <w:t>La Evidencia 2 demostró que el catálogo físico presenta una relación directa entre dimensiones mecánicas y costo de catálogo. Sin embargo, el informe previo identificó tres limitantes analíticas:</w:t>
+        <w:t>La Evidencia 2 demostró que el catálogo físico presenta una relación directa entre dimensiones mecánicas y costo. Sin embargo, el informe previo identificó tres limitantes:</w:t>
         <w:br/>
-        <w:t>1. Multicolinealidad geométrica entre el diámetro del rin (Rim) y el ancho de sección (Width) (correlación r = 0,55).</w:t>
+        <w:t>1. Correlación geométrica entre el diámetro del rin (Rim) y el ancho de sección (Width) (r = 0,57 en Train), que infla la varianza de los coeficientes lineales.</w:t>
         <w:br/>
-        <w:t>2. Incapacidad del hiperplano lineal para modelar la asimetría y el sobrecosto de cubiertas pesadas e industriales (BRAND_D) con rodados superiores a 20 pulgadas.</w:t>
+        <w:t>2. No linealidad en neumáticos pesados e industriales (BRAND_D) con rodados superiores a 20 pulgadas, cuyos sobrecostos no escalan de forma lineal aditiva.</w:t>
         <w:br/>
-        <w:t>3. Alta sensibilidad de un split único Train/Test ante muestras pequeñas (N = 251 observaciones limpias).</w:t>
+        <w:t>3. Inestabilidad de una partición única Train/Test en muestras acotadas (N = 251 observaciones limpias).</w:t>
       </w:r>
     </w:p>
     <w:p>
       <w:pPr>
         <w:keepNext/>
-        <w:spacing w:before="320" w:after="120"/>
+        <w:spacing w:before="280" w:after="80"/>
       </w:pPr>
       <w:r>
         <w:rPr>
           <w:b/>
           <w:color w:val="1B365D"/>
-          <w:sz w:val="28"/>
+          <w:sz w:val="26"/>
         </w:rPr>
         <w:t>3. Metodología de Preprocesamiento e Ingeniería de Pipelines</w:t>
       </w:r>
     </w:p>
     <w:p>
       <w:r>
-        <w:t>Para evitar data leakage, todos los pasos de transformación se encapsularon en un ColumnTransformer de Scikit-Learn:</w:t>
+        <w:t>Para erradicar la fuga de datos (data leakage), todas las transformaciones se integraron en un ColumnTransformer:</w:t>
         <w:br/>
-        <w:t>• Imputación de Aspect Ratio: Se aplicó SimpleImputer(strategy='median') calculado exclusivamente sobre los pliegues de entrenamiento de cada fold.</w:t>
+        <w:t>• Imputación de Aspect Ratio: SimpleImputer(strategy='median') calculado exclusivamente sobre los pliegues de entrenamiento de cada fold.</w:t>
         <w:br/>
-        <w:t>• Codificación Categórica: OneHotEncoder(drop=['BRAND_A']) manteniendo la marca de referencia de la Evidencia 2 para no inducir colinealidad perfecta.</w:t>
+        <w:t>• Codificación Categórica: OneHotEncoder(drop=['BRAND_A']) manteniendo la marca de referencia de la Evidencia 2 para evitar multicolinealidad exacta.</w:t>
         <w:br/>
-        <w:t>• Escalado de Variables: StandardScaler() se incorporó exclusivamente a los modelos lineales (Ridge y Lasso) para igualar el efecto de las penalizaciones L1 y L2, mientras que se omitió en los árboles (Random Forest y Gradient Boosting), los cuales son invariantes a transformaciones monótonas de escala.</w:t>
+        <w:t>• Escalado condicional: StandardScaler() aplicado únicamente a Ridge para equiparar la penalización L2 entre variables con distintas escalas; omitido en Random Forest debido a que los árboles son invariantes a transformaciones monótonas.</w:t>
       </w:r>
     </w:p>
     <w:p>
       <w:pPr>
         <w:keepNext/>
-        <w:spacing w:before="320" w:after="120"/>
+        <w:spacing w:before="280" w:after="80"/>
       </w:pPr>
       <w:r>
         <w:rPr>
           <w:b/>
           <w:color w:val="1B365D"/>
-          <w:sz w:val="28"/>
+          <w:sz w:val="26"/>
         </w:rPr>
         <w:t>4. Diseño Experimental y Búsqueda en Grilla (GridSearchCV)</w:t>
       </w:r>
     </w:p>
     <w:p>
       <w:r>
-        <w:t>Se aplicó KFold(n_splits=5, shuffle=True, random_state=42) sobre las 200 observaciones de Train. La métrica de optimización y refit fue el RMSE (neg_root_mean_squared_error). Las 51 muestras de Test se conservaron intactas como examen final.</w:t>
+        <w:t>Se utilizó KFold(n_splits=5, shuffle=True, random_state=42) sobre las 200 observaciones de Train. La métrica de optimización y refit fue neg_root_mean_squared_error. Las 51 muestras de Test se preservaron intactas como examen final.</w:t>
       </w:r>
     </w:p>
     <w:p>
       <w:pPr>
         <w:keepNext/>
-        <w:spacing w:before="320" w:after="120"/>
+        <w:spacing w:before="280" w:after="80"/>
       </w:pPr>
       <w:r>
         <w:rPr>
           <w:b/>
           <w:color w:val="1B365D"/>
-          <w:sz w:val="28"/>
+          <w:sz w:val="26"/>
         </w:rPr>
         <w:t>5. Gran Tabla Comparativa de Desempeño</w:t>
       </w:r>
@@ -369,7 +402,7 @@
                 <w:color w:val="FFFFFF"/>
                 <w:sz w:val="18"/>
               </w:rPr>
-              <w:t>Técnica</w:t>
+              <w:t>Técnica / Config</w:t>
             </w:r>
           </w:p>
         </w:tc>
@@ -567,7 +600,7 @@
               <w:rPr>
                 <w:sz w:val="17"/>
               </w:rPr>
-              <w:t>Lineal OLS</w:t>
+              <w:t>Lineal analítico</w:t>
             </w:r>
           </w:p>
         </w:tc>
@@ -900,378 +933,6 @@
         <w:tc>
           <w:tcPr>
             <w:tcW w:type="dxa" w:w="1170"/>
-            <w:shd w:fill="FFFFFF"/>
-            <w:tcMar>
-              <w:top w:w="60" w:type="dxa"/>
-              <w:bottom w:w="60" w:type="dxa"/>
-              <w:left w:w="80" w:type="dxa"/>
-              <w:right w:w="80" w:type="dxa"/>
-            </w:tcMar>
-          </w:tcPr>
-          <w:p>
-            <w:pPr>
-              <w:jc w:val="left"/>
-            </w:pPr>
-            <w:r>
-              <w:rPr>
-                <w:sz w:val="17"/>
-              </w:rPr>
-              <w:t>Lasso</w:t>
-            </w:r>
-          </w:p>
-        </w:tc>
-        <w:tc>
-          <w:tcPr>
-            <w:tcW w:type="dxa" w:w="1170"/>
-            <w:shd w:fill="FFFFFF"/>
-            <w:tcMar>
-              <w:top w:w="60" w:type="dxa"/>
-              <w:bottom w:w="60" w:type="dxa"/>
-              <w:left w:w="80" w:type="dxa"/>
-              <w:right w:w="80" w:type="dxa"/>
-            </w:tcMar>
-          </w:tcPr>
-          <w:p>
-            <w:pPr>
-              <w:jc w:val="left"/>
-            </w:pPr>
-            <w:r>
-              <w:rPr>
-                <w:sz w:val="17"/>
-              </w:rPr>
-              <w:t>L1 (α = 25.0)</w:t>
-            </w:r>
-          </w:p>
-        </w:tc>
-        <w:tc>
-          <w:tcPr>
-            <w:tcW w:type="dxa" w:w="1170"/>
-            <w:shd w:fill="FFFFFF"/>
-            <w:tcMar>
-              <w:top w:w="60" w:type="dxa"/>
-              <w:bottom w:w="60" w:type="dxa"/>
-              <w:left w:w="80" w:type="dxa"/>
-              <w:right w:w="80" w:type="dxa"/>
-            </w:tcMar>
-          </w:tcPr>
-          <w:p>
-            <w:pPr>
-              <w:jc w:val="right"/>
-            </w:pPr>
-            <w:r>
-              <w:rPr>
-                <w:sz w:val="17"/>
-              </w:rPr>
-              <w:t>2.577,68 ± 1.320</w:t>
-            </w:r>
-          </w:p>
-        </w:tc>
-        <w:tc>
-          <w:tcPr>
-            <w:tcW w:type="dxa" w:w="1170"/>
-            <w:shd w:fill="FFFFFF"/>
-            <w:tcMar>
-              <w:top w:w="60" w:type="dxa"/>
-              <w:bottom w:w="60" w:type="dxa"/>
-              <w:left w:w="80" w:type="dxa"/>
-              <w:right w:w="80" w:type="dxa"/>
-            </w:tcMar>
-          </w:tcPr>
-          <w:p>
-            <w:pPr>
-              <w:jc w:val="right"/>
-            </w:pPr>
-            <w:r>
-              <w:rPr>
-                <w:sz w:val="17"/>
-              </w:rPr>
-              <w:t>1.501,21 ± 278</w:t>
-            </w:r>
-          </w:p>
-        </w:tc>
-        <w:tc>
-          <w:tcPr>
-            <w:tcW w:type="dxa" w:w="1170"/>
-            <w:shd w:fill="FFFFFF"/>
-            <w:tcMar>
-              <w:top w:w="60" w:type="dxa"/>
-              <w:bottom w:w="60" w:type="dxa"/>
-              <w:left w:w="80" w:type="dxa"/>
-              <w:right w:w="80" w:type="dxa"/>
-            </w:tcMar>
-          </w:tcPr>
-          <w:p>
-            <w:pPr>
-              <w:jc w:val="right"/>
-            </w:pPr>
-            <w:r>
-              <w:rPr>
-                <w:sz w:val="17"/>
-              </w:rPr>
-              <w:t>0,7613</w:t>
-            </w:r>
-          </w:p>
-        </w:tc>
-        <w:tc>
-          <w:tcPr>
-            <w:tcW w:type="dxa" w:w="1170"/>
-            <w:shd w:fill="FFFFFF"/>
-            <w:tcMar>
-              <w:top w:w="60" w:type="dxa"/>
-              <w:bottom w:w="60" w:type="dxa"/>
-              <w:left w:w="80" w:type="dxa"/>
-              <w:right w:w="80" w:type="dxa"/>
-            </w:tcMar>
-          </w:tcPr>
-          <w:p>
-            <w:pPr>
-              <w:jc w:val="right"/>
-            </w:pPr>
-            <w:r>
-              <w:rPr>
-                <w:sz w:val="17"/>
-              </w:rPr>
-              <w:t>2.585,88</w:t>
-            </w:r>
-          </w:p>
-        </w:tc>
-        <w:tc>
-          <w:tcPr>
-            <w:tcW w:type="dxa" w:w="1170"/>
-            <w:shd w:fill="FFFFFF"/>
-            <w:tcMar>
-              <w:top w:w="60" w:type="dxa"/>
-              <w:bottom w:w="60" w:type="dxa"/>
-              <w:left w:w="80" w:type="dxa"/>
-              <w:right w:w="80" w:type="dxa"/>
-            </w:tcMar>
-          </w:tcPr>
-          <w:p>
-            <w:pPr>
-              <w:jc w:val="right"/>
-            </w:pPr>
-            <w:r>
-              <w:rPr>
-                <w:sz w:val="17"/>
-              </w:rPr>
-              <w:t>1.673,94</w:t>
-            </w:r>
-          </w:p>
-        </w:tc>
-        <w:tc>
-          <w:tcPr>
-            <w:tcW w:type="dxa" w:w="1170"/>
-            <w:shd w:fill="FFFFFF"/>
-            <w:tcMar>
-              <w:top w:w="60" w:type="dxa"/>
-              <w:bottom w:w="60" w:type="dxa"/>
-              <w:left w:w="80" w:type="dxa"/>
-              <w:right w:w="80" w:type="dxa"/>
-            </w:tcMar>
-          </w:tcPr>
-          <w:p>
-            <w:pPr>
-              <w:jc w:val="right"/>
-            </w:pPr>
-            <w:r>
-              <w:rPr>
-                <w:sz w:val="17"/>
-              </w:rPr>
-              <w:t>0,7910</w:t>
-            </w:r>
-          </w:p>
-        </w:tc>
-      </w:tr>
-      <w:tr>
-        <w:tc>
-          <w:tcPr>
-            <w:tcW w:type="dxa" w:w="1170"/>
-            <w:shd w:fill="F9FBFD"/>
-            <w:tcMar>
-              <w:top w:w="60" w:type="dxa"/>
-              <w:bottom w:w="60" w:type="dxa"/>
-              <w:left w:w="80" w:type="dxa"/>
-              <w:right w:w="80" w:type="dxa"/>
-            </w:tcMar>
-          </w:tcPr>
-          <w:p>
-            <w:pPr>
-              <w:jc w:val="left"/>
-            </w:pPr>
-            <w:r>
-              <w:rPr>
-                <w:sz w:val="17"/>
-              </w:rPr>
-              <w:t>Random Forest</w:t>
-            </w:r>
-          </w:p>
-        </w:tc>
-        <w:tc>
-          <w:tcPr>
-            <w:tcW w:type="dxa" w:w="1170"/>
-            <w:shd w:fill="F9FBFD"/>
-            <w:tcMar>
-              <w:top w:w="60" w:type="dxa"/>
-              <w:bottom w:w="60" w:type="dxa"/>
-              <w:left w:w="80" w:type="dxa"/>
-              <w:right w:w="80" w:type="dxa"/>
-            </w:tcMar>
-          </w:tcPr>
-          <w:p>
-            <w:pPr>
-              <w:jc w:val="left"/>
-            </w:pPr>
-            <w:r>
-              <w:rPr>
-                <w:sz w:val="17"/>
-              </w:rPr>
-              <w:t>Bagging (200 est)</w:t>
-            </w:r>
-          </w:p>
-        </w:tc>
-        <w:tc>
-          <w:tcPr>
-            <w:tcW w:type="dxa" w:w="1170"/>
-            <w:shd w:fill="F9FBFD"/>
-            <w:tcMar>
-              <w:top w:w="60" w:type="dxa"/>
-              <w:bottom w:w="60" w:type="dxa"/>
-              <w:left w:w="80" w:type="dxa"/>
-              <w:right w:w="80" w:type="dxa"/>
-            </w:tcMar>
-          </w:tcPr>
-          <w:p>
-            <w:pPr>
-              <w:jc w:val="right"/>
-            </w:pPr>
-            <w:r>
-              <w:rPr>
-                <w:sz w:val="17"/>
-              </w:rPr>
-              <w:t>1.381,01 ± 532</w:t>
-            </w:r>
-          </w:p>
-        </w:tc>
-        <w:tc>
-          <w:tcPr>
-            <w:tcW w:type="dxa" w:w="1170"/>
-            <w:shd w:fill="F9FBFD"/>
-            <w:tcMar>
-              <w:top w:w="60" w:type="dxa"/>
-              <w:bottom w:w="60" w:type="dxa"/>
-              <w:left w:w="80" w:type="dxa"/>
-              <w:right w:w="80" w:type="dxa"/>
-            </w:tcMar>
-          </w:tcPr>
-          <w:p>
-            <w:pPr>
-              <w:jc w:val="right"/>
-            </w:pPr>
-            <w:r>
-              <w:rPr>
-                <w:sz w:val="17"/>
-              </w:rPr>
-              <w:t>805,46 ± 202</w:t>
-            </w:r>
-          </w:p>
-        </w:tc>
-        <w:tc>
-          <w:tcPr>
-            <w:tcW w:type="dxa" w:w="1170"/>
-            <w:shd w:fill="F9FBFD"/>
-            <w:tcMar>
-              <w:top w:w="60" w:type="dxa"/>
-              <w:bottom w:w="60" w:type="dxa"/>
-              <w:left w:w="80" w:type="dxa"/>
-              <w:right w:w="80" w:type="dxa"/>
-            </w:tcMar>
-          </w:tcPr>
-          <w:p>
-            <w:pPr>
-              <w:jc w:val="right"/>
-            </w:pPr>
-            <w:r>
-              <w:rPr>
-                <w:sz w:val="17"/>
-              </w:rPr>
-              <w:t>0,9280</w:t>
-            </w:r>
-          </w:p>
-        </w:tc>
-        <w:tc>
-          <w:tcPr>
-            <w:tcW w:type="dxa" w:w="1170"/>
-            <w:shd w:fill="F9FBFD"/>
-            <w:tcMar>
-              <w:top w:w="60" w:type="dxa"/>
-              <w:bottom w:w="60" w:type="dxa"/>
-              <w:left w:w="80" w:type="dxa"/>
-              <w:right w:w="80" w:type="dxa"/>
-            </w:tcMar>
-          </w:tcPr>
-          <w:p>
-            <w:pPr>
-              <w:jc w:val="right"/>
-            </w:pPr>
-            <w:r>
-              <w:rPr>
-                <w:sz w:val="17"/>
-              </w:rPr>
-              <w:t>2.229,88</w:t>
-            </w:r>
-          </w:p>
-        </w:tc>
-        <w:tc>
-          <w:tcPr>
-            <w:tcW w:type="dxa" w:w="1170"/>
-            <w:shd w:fill="F9FBFD"/>
-            <w:tcMar>
-              <w:top w:w="60" w:type="dxa"/>
-              <w:bottom w:w="60" w:type="dxa"/>
-              <w:left w:w="80" w:type="dxa"/>
-              <w:right w:w="80" w:type="dxa"/>
-            </w:tcMar>
-          </w:tcPr>
-          <w:p>
-            <w:pPr>
-              <w:jc w:val="right"/>
-            </w:pPr>
-            <w:r>
-              <w:rPr>
-                <w:sz w:val="17"/>
-              </w:rPr>
-              <w:t>1.243,18</w:t>
-            </w:r>
-          </w:p>
-        </w:tc>
-        <w:tc>
-          <w:tcPr>
-            <w:tcW w:type="dxa" w:w="1170"/>
-            <w:shd w:fill="F9FBFD"/>
-            <w:tcMar>
-              <w:top w:w="60" w:type="dxa"/>
-              <w:bottom w:w="60" w:type="dxa"/>
-              <w:left w:w="80" w:type="dxa"/>
-              <w:right w:w="80" w:type="dxa"/>
-            </w:tcMar>
-          </w:tcPr>
-          <w:p>
-            <w:pPr>
-              <w:jc w:val="right"/>
-            </w:pPr>
-            <w:r>
-              <w:rPr>
-                <w:sz w:val="17"/>
-              </w:rPr>
-              <w:t>0,8446</w:t>
-            </w:r>
-          </w:p>
-        </w:tc>
-      </w:tr>
-      <w:tr>
-        <w:tc>
-          <w:tcPr>
-            <w:tcW w:type="dxa" w:w="1170"/>
             <w:shd w:fill="EBF3FA"/>
             <w:tcMar>
               <w:top w:w="60" w:type="dxa"/>
@@ -1290,7 +951,7 @@
                 <w:color w:val="006633"/>
                 <w:sz w:val="17"/>
               </w:rPr>
-              <w:t>Gradient Boosting</w:t>
+              <w:t>Random Forest</w:t>
             </w:r>
           </w:p>
         </w:tc>
@@ -1315,7 +976,7 @@
                 <w:color w:val="006633"/>
                 <w:sz w:val="17"/>
               </w:rPr>
-              <w:t>Boosting (150 est)</w:t>
+              <w:t>Bagging (200 est)</w:t>
             </w:r>
           </w:p>
         </w:tc>
@@ -1340,7 +1001,7 @@
                 <w:color w:val="006633"/>
                 <w:sz w:val="17"/>
               </w:rPr>
-              <w:t>1.432,78 ± 760</w:t>
+              <w:t>1.381,01 ± 532</w:t>
             </w:r>
           </w:p>
         </w:tc>
@@ -1365,7 +1026,7 @@
                 <w:color w:val="006633"/>
                 <w:sz w:val="17"/>
               </w:rPr>
-              <w:t>776,35 ± 225</w:t>
+              <w:t>805,46 ± 202</w:t>
             </w:r>
           </w:p>
         </w:tc>
@@ -1390,7 +1051,7 @@
                 <w:color w:val="006633"/>
                 <w:sz w:val="17"/>
               </w:rPr>
-              <w:t>0,9192</w:t>
+              <w:t>0,9280</w:t>
             </w:r>
           </w:p>
         </w:tc>
@@ -1415,7 +1076,7 @@
                 <w:color w:val="006633"/>
                 <w:sz w:val="17"/>
               </w:rPr>
-              <w:t>1.577,13</w:t>
+              <w:t>2.229,88</w:t>
             </w:r>
           </w:p>
         </w:tc>
@@ -1440,7 +1101,7 @@
                 <w:color w:val="006633"/>
                 <w:sz w:val="17"/>
               </w:rPr>
-              <w:t>975,85</w:t>
+              <w:t>1.243,18</w:t>
             </w:r>
           </w:p>
         </w:tc>
@@ -1465,7 +1126,7 @@
                 <w:color w:val="006633"/>
                 <w:sz w:val="17"/>
               </w:rPr>
-              <w:t>0,9223</w:t>
+              <w:t>0,8446</w:t>
             </w:r>
           </w:p>
         </w:tc>
@@ -1473,7 +1134,7 @@
     </w:tbl>
     <w:p>
       <w:pPr>
-        <w:spacing w:before="80" w:after="240"/>
+        <w:spacing w:before="80" w:after="200"/>
       </w:pPr>
       <w:r>
         <w:rPr>
@@ -1481,42 +1142,909 @@
           <w:color w:val="646464"/>
           <w:sz w:val="17"/>
         </w:rPr>
-        <w:t>Nota: La fila resaltada en verde indica el modelo ganador (Gradient Boosting Regressor) con R² superior al 92% y MAE inferior a 1.000 INR.</w:t>
+        <w:t>Nota: La fila resaltada en verde indica el modelo ganador (Random Forest Regressor) seleccionado por validación cruzada.</w:t>
       </w:r>
     </w:p>
     <w:p>
       <w:pPr>
         <w:keepNext/>
-        <w:spacing w:before="320" w:after="120"/>
+        <w:spacing w:before="200" w:after="60"/>
+      </w:pPr>
+      <w:r>
+        <w:rPr>
+          <w:b/>
+          <w:color w:val="006699"/>
+          <w:sz w:val="23"/>
+        </w:rPr>
+        <w:t>5.1 Comparación Pareada Fold por Fold (CV 5-Fold)</w:t>
+      </w:r>
+    </w:p>
+    <w:tbl>
+      <w:tblPr>
+        <w:tblW w:type="auto" w:w="0"/>
+        <w:jc w:val="center"/>
+        <w:tblLook w:firstColumn="1" w:firstRow="1" w:lastColumn="0" w:lastRow="0" w:noHBand="0" w:noVBand="1" w:val="04A0"/>
+      </w:tblPr>
+      <w:tblGrid>
+        <w:gridCol w:w="1872"/>
+        <w:gridCol w:w="1872"/>
+        <w:gridCol w:w="1872"/>
+        <w:gridCol w:w="1872"/>
+        <w:gridCol w:w="1872"/>
+      </w:tblGrid>
+      <w:tr>
+        <w:tc>
+          <w:tcPr>
+            <w:tcW w:type="dxa" w:w="1872"/>
+            <w:shd w:fill="1B365D"/>
+            <w:tcMar>
+              <w:top w:w="70" w:type="dxa"/>
+              <w:bottom w:w="70" w:type="dxa"/>
+              <w:left w:w="90" w:type="dxa"/>
+              <w:right w:w="90" w:type="dxa"/>
+            </w:tcMar>
+          </w:tcPr>
+          <w:p>
+            <w:pPr>
+              <w:jc w:val="center"/>
+            </w:pPr>
+            <w:r>
+              <w:rPr>
+                <w:b/>
+                <w:color w:val="FFFFFF"/>
+                <w:sz w:val="17"/>
+              </w:rPr>
+              <w:t>Pliegue</w:t>
+            </w:r>
+          </w:p>
+        </w:tc>
+        <w:tc>
+          <w:tcPr>
+            <w:tcW w:type="dxa" w:w="1872"/>
+            <w:shd w:fill="1B365D"/>
+            <w:tcMar>
+              <w:top w:w="70" w:type="dxa"/>
+              <w:bottom w:w="70" w:type="dxa"/>
+              <w:left w:w="90" w:type="dxa"/>
+              <w:right w:w="90" w:type="dxa"/>
+            </w:tcMar>
+          </w:tcPr>
+          <w:p>
+            <w:pPr>
+              <w:jc w:val="center"/>
+            </w:pPr>
+            <w:r>
+              <w:rPr>
+                <w:b/>
+                <w:color w:val="FFFFFF"/>
+                <w:sz w:val="17"/>
+              </w:rPr>
+              <w:t>OLS Baseline</w:t>
+            </w:r>
+          </w:p>
+        </w:tc>
+        <w:tc>
+          <w:tcPr>
+            <w:tcW w:type="dxa" w:w="1872"/>
+            <w:shd w:fill="1B365D"/>
+            <w:tcMar>
+              <w:top w:w="70" w:type="dxa"/>
+              <w:bottom w:w="70" w:type="dxa"/>
+              <w:left w:w="90" w:type="dxa"/>
+              <w:right w:w="90" w:type="dxa"/>
+            </w:tcMar>
+          </w:tcPr>
+          <w:p>
+            <w:pPr>
+              <w:jc w:val="center"/>
+            </w:pPr>
+            <w:r>
+              <w:rPr>
+                <w:b/>
+                <w:color w:val="FFFFFF"/>
+                <w:sz w:val="17"/>
+              </w:rPr>
+              <w:t>Ridge (α=5.0)</w:t>
+            </w:r>
+          </w:p>
+        </w:tc>
+        <w:tc>
+          <w:tcPr>
+            <w:tcW w:type="dxa" w:w="1872"/>
+            <w:shd w:fill="1B365D"/>
+            <w:tcMar>
+              <w:top w:w="70" w:type="dxa"/>
+              <w:bottom w:w="70" w:type="dxa"/>
+              <w:left w:w="90" w:type="dxa"/>
+              <w:right w:w="90" w:type="dxa"/>
+            </w:tcMar>
+          </w:tcPr>
+          <w:p>
+            <w:pPr>
+              <w:jc w:val="center"/>
+            </w:pPr>
+            <w:r>
+              <w:rPr>
+                <w:b/>
+                <w:color w:val="FFFFFF"/>
+                <w:sz w:val="17"/>
+              </w:rPr>
+              <w:t>Random Forest</w:t>
+            </w:r>
+          </w:p>
+        </w:tc>
+        <w:tc>
+          <w:tcPr>
+            <w:tcW w:type="dxa" w:w="1872"/>
+            <w:shd w:fill="1B365D"/>
+            <w:tcMar>
+              <w:top w:w="70" w:type="dxa"/>
+              <w:bottom w:w="70" w:type="dxa"/>
+              <w:left w:w="90" w:type="dxa"/>
+              <w:right w:w="90" w:type="dxa"/>
+            </w:tcMar>
+          </w:tcPr>
+          <w:p>
+            <w:pPr>
+              <w:jc w:val="center"/>
+            </w:pPr>
+            <w:r>
+              <w:rPr>
+                <w:b/>
+                <w:color w:val="FFFFFF"/>
+                <w:sz w:val="17"/>
+              </w:rPr>
+              <w:t>Diferencia OLS vs RF</w:t>
+            </w:r>
+          </w:p>
+        </w:tc>
+      </w:tr>
+      <w:tr>
+        <w:tc>
+          <w:tcPr>
+            <w:tcW w:type="dxa" w:w="1872"/>
+            <w:shd w:fill="FFFFFF"/>
+            <w:tcMar>
+              <w:top w:w="50" w:type="dxa"/>
+              <w:bottom w:w="50" w:type="dxa"/>
+              <w:left w:w="70" w:type="dxa"/>
+              <w:right w:w="70" w:type="dxa"/>
+            </w:tcMar>
+          </w:tcPr>
+          <w:p>
+            <w:pPr>
+              <w:jc w:val="left"/>
+            </w:pPr>
+            <w:r>
+              <w:rPr>
+                <w:sz w:val="16"/>
+              </w:rPr>
+              <w:t>Fold 1</w:t>
+            </w:r>
+          </w:p>
+        </w:tc>
+        <w:tc>
+          <w:tcPr>
+            <w:tcW w:type="dxa" w:w="1872"/>
+            <w:shd w:fill="FFFFFF"/>
+            <w:tcMar>
+              <w:top w:w="50" w:type="dxa"/>
+              <w:bottom w:w="50" w:type="dxa"/>
+              <w:left w:w="70" w:type="dxa"/>
+              <w:right w:w="70" w:type="dxa"/>
+            </w:tcMar>
+          </w:tcPr>
+          <w:p>
+            <w:pPr>
+              <w:jc w:val="right"/>
+            </w:pPr>
+            <w:r>
+              <w:rPr>
+                <w:sz w:val="16"/>
+              </w:rPr>
+              <w:t>2.023,4 INR</w:t>
+            </w:r>
+          </w:p>
+        </w:tc>
+        <w:tc>
+          <w:tcPr>
+            <w:tcW w:type="dxa" w:w="1872"/>
+            <w:shd w:fill="FFFFFF"/>
+            <w:tcMar>
+              <w:top w:w="50" w:type="dxa"/>
+              <w:bottom w:w="50" w:type="dxa"/>
+              <w:left w:w="70" w:type="dxa"/>
+              <w:right w:w="70" w:type="dxa"/>
+            </w:tcMar>
+          </w:tcPr>
+          <w:p>
+            <w:pPr>
+              <w:jc w:val="right"/>
+            </w:pPr>
+            <w:r>
+              <w:rPr>
+                <w:sz w:val="16"/>
+              </w:rPr>
+              <w:t>2.011,2 INR</w:t>
+            </w:r>
+          </w:p>
+        </w:tc>
+        <w:tc>
+          <w:tcPr>
+            <w:tcW w:type="dxa" w:w="1872"/>
+            <w:shd w:fill="FFFFFF"/>
+            <w:tcMar>
+              <w:top w:w="50" w:type="dxa"/>
+              <w:bottom w:w="50" w:type="dxa"/>
+              <w:left w:w="70" w:type="dxa"/>
+              <w:right w:w="70" w:type="dxa"/>
+            </w:tcMar>
+          </w:tcPr>
+          <w:p>
+            <w:pPr>
+              <w:jc w:val="right"/>
+            </w:pPr>
+            <w:r>
+              <w:rPr>
+                <w:sz w:val="16"/>
+              </w:rPr>
+              <w:t>1.212,4 INR</w:t>
+            </w:r>
+          </w:p>
+        </w:tc>
+        <w:tc>
+          <w:tcPr>
+            <w:tcW w:type="dxa" w:w="1872"/>
+            <w:shd w:fill="FFFFFF"/>
+            <w:tcMar>
+              <w:top w:w="50" w:type="dxa"/>
+              <w:bottom w:w="50" w:type="dxa"/>
+              <w:left w:w="70" w:type="dxa"/>
+              <w:right w:w="70" w:type="dxa"/>
+            </w:tcMar>
+          </w:tcPr>
+          <w:p>
+            <w:pPr>
+              <w:jc w:val="right"/>
+            </w:pPr>
+            <w:r>
+              <w:rPr>
+                <w:sz w:val="16"/>
+              </w:rPr>
+              <w:t>+811,0 INR</w:t>
+            </w:r>
+          </w:p>
+        </w:tc>
+      </w:tr>
+      <w:tr>
+        <w:tc>
+          <w:tcPr>
+            <w:tcW w:type="dxa" w:w="1872"/>
+            <w:shd w:fill="F9FBFD"/>
+            <w:tcMar>
+              <w:top w:w="50" w:type="dxa"/>
+              <w:bottom w:w="50" w:type="dxa"/>
+              <w:left w:w="70" w:type="dxa"/>
+              <w:right w:w="70" w:type="dxa"/>
+            </w:tcMar>
+          </w:tcPr>
+          <w:p>
+            <w:pPr>
+              <w:jc w:val="left"/>
+            </w:pPr>
+            <w:r>
+              <w:rPr>
+                <w:sz w:val="16"/>
+              </w:rPr>
+              <w:t>Fold 2</w:t>
+            </w:r>
+          </w:p>
+        </w:tc>
+        <w:tc>
+          <w:tcPr>
+            <w:tcW w:type="dxa" w:w="1872"/>
+            <w:shd w:fill="F9FBFD"/>
+            <w:tcMar>
+              <w:top w:w="50" w:type="dxa"/>
+              <w:bottom w:w="50" w:type="dxa"/>
+              <w:left w:w="70" w:type="dxa"/>
+              <w:right w:w="70" w:type="dxa"/>
+            </w:tcMar>
+          </w:tcPr>
+          <w:p>
+            <w:pPr>
+              <w:jc w:val="right"/>
+            </w:pPr>
+            <w:r>
+              <w:rPr>
+                <w:sz w:val="16"/>
+              </w:rPr>
+              <w:t>2.212,0 INR</w:t>
+            </w:r>
+          </w:p>
+        </w:tc>
+        <w:tc>
+          <w:tcPr>
+            <w:tcW w:type="dxa" w:w="1872"/>
+            <w:shd w:fill="F9FBFD"/>
+            <w:tcMar>
+              <w:top w:w="50" w:type="dxa"/>
+              <w:bottom w:w="50" w:type="dxa"/>
+              <w:left w:w="70" w:type="dxa"/>
+              <w:right w:w="70" w:type="dxa"/>
+            </w:tcMar>
+          </w:tcPr>
+          <w:p>
+            <w:pPr>
+              <w:jc w:val="right"/>
+            </w:pPr>
+            <w:r>
+              <w:rPr>
+                <w:sz w:val="16"/>
+              </w:rPr>
+              <w:t>2.112,0 INR</w:t>
+            </w:r>
+          </w:p>
+        </w:tc>
+        <w:tc>
+          <w:tcPr>
+            <w:tcW w:type="dxa" w:w="1872"/>
+            <w:shd w:fill="F9FBFD"/>
+            <w:tcMar>
+              <w:top w:w="50" w:type="dxa"/>
+              <w:bottom w:w="50" w:type="dxa"/>
+              <w:left w:w="70" w:type="dxa"/>
+              <w:right w:w="70" w:type="dxa"/>
+            </w:tcMar>
+          </w:tcPr>
+          <w:p>
+            <w:pPr>
+              <w:jc w:val="right"/>
+            </w:pPr>
+            <w:r>
+              <w:rPr>
+                <w:sz w:val="16"/>
+              </w:rPr>
+              <w:t>2.187,1 INR</w:t>
+            </w:r>
+          </w:p>
+        </w:tc>
+        <w:tc>
+          <w:tcPr>
+            <w:tcW w:type="dxa" w:w="1872"/>
+            <w:shd w:fill="F9FBFD"/>
+            <w:tcMar>
+              <w:top w:w="50" w:type="dxa"/>
+              <w:bottom w:w="50" w:type="dxa"/>
+              <w:left w:w="70" w:type="dxa"/>
+              <w:right w:w="70" w:type="dxa"/>
+            </w:tcMar>
+          </w:tcPr>
+          <w:p>
+            <w:pPr>
+              <w:jc w:val="right"/>
+            </w:pPr>
+            <w:r>
+              <w:rPr>
+                <w:sz w:val="16"/>
+              </w:rPr>
+              <w:t>+24,9 INR</w:t>
+            </w:r>
+          </w:p>
+        </w:tc>
+      </w:tr>
+      <w:tr>
+        <w:tc>
+          <w:tcPr>
+            <w:tcW w:type="dxa" w:w="1872"/>
+            <w:shd w:fill="FFFFFF"/>
+            <w:tcMar>
+              <w:top w:w="50" w:type="dxa"/>
+              <w:bottom w:w="50" w:type="dxa"/>
+              <w:left w:w="70" w:type="dxa"/>
+              <w:right w:w="70" w:type="dxa"/>
+            </w:tcMar>
+          </w:tcPr>
+          <w:p>
+            <w:pPr>
+              <w:jc w:val="left"/>
+            </w:pPr>
+            <w:r>
+              <w:rPr>
+                <w:sz w:val="16"/>
+              </w:rPr>
+              <w:t>Fold 3</w:t>
+            </w:r>
+          </w:p>
+        </w:tc>
+        <w:tc>
+          <w:tcPr>
+            <w:tcW w:type="dxa" w:w="1872"/>
+            <w:shd w:fill="FFFFFF"/>
+            <w:tcMar>
+              <w:top w:w="50" w:type="dxa"/>
+              <w:bottom w:w="50" w:type="dxa"/>
+              <w:left w:w="70" w:type="dxa"/>
+              <w:right w:w="70" w:type="dxa"/>
+            </w:tcMar>
+          </w:tcPr>
+          <w:p>
+            <w:pPr>
+              <w:jc w:val="right"/>
+            </w:pPr>
+            <w:r>
+              <w:rPr>
+                <w:sz w:val="16"/>
+              </w:rPr>
+              <w:t>1.881,8 INR</w:t>
+            </w:r>
+          </w:p>
+        </w:tc>
+        <w:tc>
+          <w:tcPr>
+            <w:tcW w:type="dxa" w:w="1872"/>
+            <w:shd w:fill="FFFFFF"/>
+            <w:tcMar>
+              <w:top w:w="50" w:type="dxa"/>
+              <w:bottom w:w="50" w:type="dxa"/>
+              <w:left w:w="70" w:type="dxa"/>
+              <w:right w:w="70" w:type="dxa"/>
+            </w:tcMar>
+          </w:tcPr>
+          <w:p>
+            <w:pPr>
+              <w:jc w:val="right"/>
+            </w:pPr>
+            <w:r>
+              <w:rPr>
+                <w:sz w:val="16"/>
+              </w:rPr>
+              <w:t>2.016,4 INR</w:t>
+            </w:r>
+          </w:p>
+        </w:tc>
+        <w:tc>
+          <w:tcPr>
+            <w:tcW w:type="dxa" w:w="1872"/>
+            <w:shd w:fill="FFFFFF"/>
+            <w:tcMar>
+              <w:top w:w="50" w:type="dxa"/>
+              <w:bottom w:w="50" w:type="dxa"/>
+              <w:left w:w="70" w:type="dxa"/>
+              <w:right w:w="70" w:type="dxa"/>
+            </w:tcMar>
+          </w:tcPr>
+          <w:p>
+            <w:pPr>
+              <w:jc w:val="right"/>
+            </w:pPr>
+            <w:r>
+              <w:rPr>
+                <w:sz w:val="16"/>
+              </w:rPr>
+              <w:t>880,1 INR</w:t>
+            </w:r>
+          </w:p>
+        </w:tc>
+        <w:tc>
+          <w:tcPr>
+            <w:tcW w:type="dxa" w:w="1872"/>
+            <w:shd w:fill="FFFFFF"/>
+            <w:tcMar>
+              <w:top w:w="50" w:type="dxa"/>
+              <w:bottom w:w="50" w:type="dxa"/>
+              <w:left w:w="70" w:type="dxa"/>
+              <w:right w:w="70" w:type="dxa"/>
+            </w:tcMar>
+          </w:tcPr>
+          <w:p>
+            <w:pPr>
+              <w:jc w:val="right"/>
+            </w:pPr>
+            <w:r>
+              <w:rPr>
+                <w:sz w:val="16"/>
+              </w:rPr>
+              <w:t>+1.001,7 INR</w:t>
+            </w:r>
+          </w:p>
+        </w:tc>
+      </w:tr>
+      <w:tr>
+        <w:tc>
+          <w:tcPr>
+            <w:tcW w:type="dxa" w:w="1872"/>
+            <w:shd w:fill="F9FBFD"/>
+            <w:tcMar>
+              <w:top w:w="50" w:type="dxa"/>
+              <w:bottom w:w="50" w:type="dxa"/>
+              <w:left w:w="70" w:type="dxa"/>
+              <w:right w:w="70" w:type="dxa"/>
+            </w:tcMar>
+          </w:tcPr>
+          <w:p>
+            <w:pPr>
+              <w:jc w:val="left"/>
+            </w:pPr>
+            <w:r>
+              <w:rPr>
+                <w:sz w:val="16"/>
+              </w:rPr>
+              <w:t>Fold 4</w:t>
+            </w:r>
+          </w:p>
+        </w:tc>
+        <w:tc>
+          <w:tcPr>
+            <w:tcW w:type="dxa" w:w="1872"/>
+            <w:shd w:fill="F9FBFD"/>
+            <w:tcMar>
+              <w:top w:w="50" w:type="dxa"/>
+              <w:bottom w:w="50" w:type="dxa"/>
+              <w:left w:w="70" w:type="dxa"/>
+              <w:right w:w="70" w:type="dxa"/>
+            </w:tcMar>
+          </w:tcPr>
+          <w:p>
+            <w:pPr>
+              <w:jc w:val="right"/>
+            </w:pPr>
+            <w:r>
+              <w:rPr>
+                <w:sz w:val="16"/>
+              </w:rPr>
+              <w:t>5.257,2 INR</w:t>
+            </w:r>
+          </w:p>
+        </w:tc>
+        <w:tc>
+          <w:tcPr>
+            <w:tcW w:type="dxa" w:w="1872"/>
+            <w:shd w:fill="F9FBFD"/>
+            <w:tcMar>
+              <w:top w:w="50" w:type="dxa"/>
+              <w:bottom w:w="50" w:type="dxa"/>
+              <w:left w:w="70" w:type="dxa"/>
+              <w:right w:w="70" w:type="dxa"/>
+            </w:tcMar>
+          </w:tcPr>
+          <w:p>
+            <w:pPr>
+              <w:jc w:val="right"/>
+            </w:pPr>
+            <w:r>
+              <w:rPr>
+                <w:sz w:val="16"/>
+              </w:rPr>
+              <w:t>5.033,0 INR</w:t>
+            </w:r>
+          </w:p>
+        </w:tc>
+        <w:tc>
+          <w:tcPr>
+            <w:tcW w:type="dxa" w:w="1872"/>
+            <w:shd w:fill="F9FBFD"/>
+            <w:tcMar>
+              <w:top w:w="50" w:type="dxa"/>
+              <w:bottom w:w="50" w:type="dxa"/>
+              <w:left w:w="70" w:type="dxa"/>
+              <w:right w:w="70" w:type="dxa"/>
+            </w:tcMar>
+          </w:tcPr>
+          <w:p>
+            <w:pPr>
+              <w:jc w:val="right"/>
+            </w:pPr>
+            <w:r>
+              <w:rPr>
+                <w:sz w:val="16"/>
+              </w:rPr>
+              <w:t>1.803,1 INR</w:t>
+            </w:r>
+          </w:p>
+        </w:tc>
+        <w:tc>
+          <w:tcPr>
+            <w:tcW w:type="dxa" w:w="1872"/>
+            <w:shd w:fill="F9FBFD"/>
+            <w:tcMar>
+              <w:top w:w="50" w:type="dxa"/>
+              <w:bottom w:w="50" w:type="dxa"/>
+              <w:left w:w="70" w:type="dxa"/>
+              <w:right w:w="70" w:type="dxa"/>
+            </w:tcMar>
+          </w:tcPr>
+          <w:p>
+            <w:pPr>
+              <w:jc w:val="right"/>
+            </w:pPr>
+            <w:r>
+              <w:rPr>
+                <w:sz w:val="16"/>
+              </w:rPr>
+              <w:t>+3.454,1 INR</w:t>
+            </w:r>
+          </w:p>
+        </w:tc>
+      </w:tr>
+      <w:tr>
+        <w:tc>
+          <w:tcPr>
+            <w:tcW w:type="dxa" w:w="1872"/>
+            <w:shd w:fill="FFFFFF"/>
+            <w:tcMar>
+              <w:top w:w="50" w:type="dxa"/>
+              <w:bottom w:w="50" w:type="dxa"/>
+              <w:left w:w="70" w:type="dxa"/>
+              <w:right w:w="70" w:type="dxa"/>
+            </w:tcMar>
+          </w:tcPr>
+          <w:p>
+            <w:pPr>
+              <w:jc w:val="left"/>
+            </w:pPr>
+            <w:r>
+              <w:rPr>
+                <w:sz w:val="16"/>
+              </w:rPr>
+              <w:t>Fold 5</w:t>
+            </w:r>
+          </w:p>
+        </w:tc>
+        <w:tc>
+          <w:tcPr>
+            <w:tcW w:type="dxa" w:w="1872"/>
+            <w:shd w:fill="FFFFFF"/>
+            <w:tcMar>
+              <w:top w:w="50" w:type="dxa"/>
+              <w:bottom w:w="50" w:type="dxa"/>
+              <w:left w:w="70" w:type="dxa"/>
+              <w:right w:w="70" w:type="dxa"/>
+            </w:tcMar>
+          </w:tcPr>
+          <w:p>
+            <w:pPr>
+              <w:jc w:val="right"/>
+            </w:pPr>
+            <w:r>
+              <w:rPr>
+                <w:sz w:val="16"/>
+              </w:rPr>
+              <w:t>1.572,1 INR</w:t>
+            </w:r>
+          </w:p>
+        </w:tc>
+        <w:tc>
+          <w:tcPr>
+            <w:tcW w:type="dxa" w:w="1872"/>
+            <w:shd w:fill="FFFFFF"/>
+            <w:tcMar>
+              <w:top w:w="50" w:type="dxa"/>
+              <w:bottom w:w="50" w:type="dxa"/>
+              <w:left w:w="70" w:type="dxa"/>
+              <w:right w:w="70" w:type="dxa"/>
+            </w:tcMar>
+          </w:tcPr>
+          <w:p>
+            <w:pPr>
+              <w:jc w:val="right"/>
+            </w:pPr>
+            <w:r>
+              <w:rPr>
+                <w:sz w:val="16"/>
+              </w:rPr>
+              <w:t>1.564,9 INR</w:t>
+            </w:r>
+          </w:p>
+        </w:tc>
+        <w:tc>
+          <w:tcPr>
+            <w:tcW w:type="dxa" w:w="1872"/>
+            <w:shd w:fill="FFFFFF"/>
+            <w:tcMar>
+              <w:top w:w="50" w:type="dxa"/>
+              <w:bottom w:w="50" w:type="dxa"/>
+              <w:left w:w="70" w:type="dxa"/>
+              <w:right w:w="70" w:type="dxa"/>
+            </w:tcMar>
+          </w:tcPr>
+          <w:p>
+            <w:pPr>
+              <w:jc w:val="right"/>
+            </w:pPr>
+            <w:r>
+              <w:rPr>
+                <w:sz w:val="16"/>
+              </w:rPr>
+              <w:t>822,4 INR</w:t>
+            </w:r>
+          </w:p>
+        </w:tc>
+        <w:tc>
+          <w:tcPr>
+            <w:tcW w:type="dxa" w:w="1872"/>
+            <w:shd w:fill="FFFFFF"/>
+            <w:tcMar>
+              <w:top w:w="50" w:type="dxa"/>
+              <w:bottom w:w="50" w:type="dxa"/>
+              <w:left w:w="70" w:type="dxa"/>
+              <w:right w:w="70" w:type="dxa"/>
+            </w:tcMar>
+          </w:tcPr>
+          <w:p>
+            <w:pPr>
+              <w:jc w:val="right"/>
+            </w:pPr>
+            <w:r>
+              <w:rPr>
+                <w:sz w:val="16"/>
+              </w:rPr>
+              <w:t>+749,7 INR</w:t>
+            </w:r>
+          </w:p>
+        </w:tc>
+      </w:tr>
+      <w:tr>
+        <w:tc>
+          <w:tcPr>
+            <w:tcW w:type="dxa" w:w="1872"/>
+            <w:shd w:fill="EBF3FA"/>
+            <w:tcMar>
+              <w:top w:w="50" w:type="dxa"/>
+              <w:bottom w:w="50" w:type="dxa"/>
+              <w:left w:w="70" w:type="dxa"/>
+              <w:right w:w="70" w:type="dxa"/>
+            </w:tcMar>
+          </w:tcPr>
+          <w:p>
+            <w:pPr>
+              <w:jc w:val="left"/>
+            </w:pPr>
+            <w:r>
+              <w:rPr>
+                <w:b/>
+                <w:sz w:val="16"/>
+              </w:rPr>
+              <w:t>Promedio ± Desvío</w:t>
+            </w:r>
+          </w:p>
+        </w:tc>
+        <w:tc>
+          <w:tcPr>
+            <w:tcW w:type="dxa" w:w="1872"/>
+            <w:shd w:fill="EBF3FA"/>
+            <w:tcMar>
+              <w:top w:w="50" w:type="dxa"/>
+              <w:bottom w:w="50" w:type="dxa"/>
+              <w:left w:w="70" w:type="dxa"/>
+              <w:right w:w="70" w:type="dxa"/>
+            </w:tcMar>
+          </w:tcPr>
+          <w:p>
+            <w:pPr>
+              <w:jc w:val="right"/>
+            </w:pPr>
+            <w:r>
+              <w:rPr>
+                <w:b/>
+                <w:sz w:val="16"/>
+              </w:rPr>
+              <w:t>2.589,3 ± 1.350</w:t>
+            </w:r>
+          </w:p>
+        </w:tc>
+        <w:tc>
+          <w:tcPr>
+            <w:tcW w:type="dxa" w:w="1872"/>
+            <w:shd w:fill="EBF3FA"/>
+            <w:tcMar>
+              <w:top w:w="50" w:type="dxa"/>
+              <w:bottom w:w="50" w:type="dxa"/>
+              <w:left w:w="70" w:type="dxa"/>
+              <w:right w:w="70" w:type="dxa"/>
+            </w:tcMar>
+          </w:tcPr>
+          <w:p>
+            <w:pPr>
+              <w:jc w:val="right"/>
+            </w:pPr>
+            <w:r>
+              <w:rPr>
+                <w:b/>
+                <w:sz w:val="16"/>
+              </w:rPr>
+              <w:t>2.547,5 ± 1.257</w:t>
+            </w:r>
+          </w:p>
+        </w:tc>
+        <w:tc>
+          <w:tcPr>
+            <w:tcW w:type="dxa" w:w="1872"/>
+            <w:shd w:fill="EBF3FA"/>
+            <w:tcMar>
+              <w:top w:w="50" w:type="dxa"/>
+              <w:bottom w:w="50" w:type="dxa"/>
+              <w:left w:w="70" w:type="dxa"/>
+              <w:right w:w="70" w:type="dxa"/>
+            </w:tcMar>
+          </w:tcPr>
+          <w:p>
+            <w:pPr>
+              <w:jc w:val="right"/>
+            </w:pPr>
+            <w:r>
+              <w:rPr>
+                <w:b/>
+                <w:sz w:val="16"/>
+              </w:rPr>
+              <w:t>1.381,0 ± 533</w:t>
+            </w:r>
+          </w:p>
+        </w:tc>
+        <w:tc>
+          <w:tcPr>
+            <w:tcW w:type="dxa" w:w="1872"/>
+            <w:shd w:fill="EBF3FA"/>
+            <w:tcMar>
+              <w:top w:w="50" w:type="dxa"/>
+              <w:bottom w:w="50" w:type="dxa"/>
+              <w:left w:w="70" w:type="dxa"/>
+              <w:right w:w="70" w:type="dxa"/>
+            </w:tcMar>
+          </w:tcPr>
+          <w:p>
+            <w:pPr>
+              <w:jc w:val="right"/>
+            </w:pPr>
+            <w:r>
+              <w:rPr>
+                <w:b/>
+                <w:sz w:val="16"/>
+              </w:rPr>
+              <w:t>+1.208,3 ± 1.309 INR</w:t>
+            </w:r>
+          </w:p>
+        </w:tc>
+      </w:tr>
+    </w:tbl>
+    <w:p>
+      <w:pPr>
+        <w:spacing w:after="160"/>
+      </w:pPr>
+    </w:p>
+    <w:p>
+      <w:pPr>
+        <w:keepNext/>
+        <w:spacing w:before="280" w:after="80"/>
       </w:pPr>
       <w:r>
         <w:rPr>
           <w:b/>
           <w:color w:val="1B365D"/>
-          <w:sz w:val="28"/>
+          <w:sz w:val="26"/>
         </w:rPr>
-        <w:t>6. Gráficos Diagnósticos del Modelo Ganador</w:t>
+        <w:t>6. Diagnóstico del Modelo Ganador (Random Forest)</w:t>
       </w:r>
     </w:p>
     <w:p>
       <w:pPr>
         <w:keepNext/>
-        <w:spacing w:before="200" w:after="80"/>
+        <w:spacing w:before="200" w:after="60"/>
       </w:pPr>
       <w:r>
         <w:rPr>
           <w:b/>
           <w:color w:val="006699"/>
-          <w:sz w:val="24"/>
+          <w:sz w:val="23"/>
         </w:rPr>
-        <w:t>6.1 Comparación de Distribución de RMSE en Validación Cruzada (5-Fold)</w:t>
+        <w:t>6.1 Distribución de RMSE en Validación Cruzada (5-Fold)</w:t>
       </w:r>
     </w:p>
     <w:p>
       <w:r>
         <w:drawing>
           <wp:inline xmlns:a="http://schemas.openxmlformats.org/drawingml/2006/main" xmlns:pic="http://schemas.openxmlformats.org/drawingml/2006/picture">
-            <wp:extent cx="5486400" cy="3048000"/>
+            <wp:extent cx="5303520" cy="2946400"/>
             <wp:docPr id="1" name="Picture 1"/>
             <wp:cNvGraphicFramePr>
               <a:graphicFrameLocks noChangeAspect="1"/>
@@ -1537,7 +2065,7 @@
                   <pic:spPr>
                     <a:xfrm>
                       <a:off x="0" y="0"/>
-                      <a:ext cx="5486400" cy="3048000"/>
+                      <a:ext cx="5303520" cy="2946400"/>
                     </a:xfrm>
                     <a:prstGeom prst="rect"/>
                   </pic:spPr>
@@ -1556,19 +2084,19 @@
         <w:rPr>
           <w:i/>
         </w:rPr>
-        <w:t>Figura 1: Boxplot comparativo de RMSE en CV (5-Fold). Random Forest y Gradient Boosting reducen la dispersión de error drásticamente frente a los lineales.</w:t>
+        <w:t>Figura 1: Boxplot de RMSE en CV 5-Fold. Random Forest muestra una reducción marcada y mayor estabilidad que los modelos lineales.</w:t>
       </w:r>
     </w:p>
     <w:p>
       <w:pPr>
         <w:keepNext/>
-        <w:spacing w:before="200" w:after="80"/>
+        <w:spacing w:before="200" w:after="60"/>
       </w:pPr>
       <w:r>
         <w:rPr>
           <w:b/>
           <w:color w:val="006699"/>
-          <w:sz w:val="24"/>
+          <w:sz w:val="23"/>
         </w:rPr>
         <w:t>6.2 Importancia de Características (Feature Importances)</w:t>
       </w:r>
@@ -1617,19 +2145,19 @@
         <w:rPr>
           <w:i/>
         </w:rPr>
-        <w:t>Figura 2: Importancia relativa de variables en Gradient Boosting. Rim (43,8%) y Width (36,5%) dominan el 80% del comportamiento predictivo.</w:t>
+        <w:t>Figura 2: Importancia de variables en Random Forest: Width (40,3%), Rim (32,1%), BRAND_D (13,2%) y Ratio (11,9%).</w:t>
       </w:r>
     </w:p>
     <w:p>
       <w:pPr>
         <w:keepNext/>
-        <w:spacing w:before="200" w:after="80"/>
+        <w:spacing w:before="200" w:after="60"/>
       </w:pPr>
       <w:r>
         <w:rPr>
           <w:b/>
           <w:color w:val="006699"/>
-          <w:sz w:val="24"/>
+          <w:sz w:val="23"/>
         </w:rPr>
         <w:t>6.3 Valores Reales vs. Predichos en Conjunto de Prueba (N = 51)</w:t>
       </w:r>
@@ -1638,7 +2166,7 @@
       <w:r>
         <w:drawing>
           <wp:inline xmlns:a="http://schemas.openxmlformats.org/drawingml/2006/main" xmlns:pic="http://schemas.openxmlformats.org/drawingml/2006/picture">
-            <wp:extent cx="5303520" cy="3535680"/>
+            <wp:extent cx="5120640" cy="3413760"/>
             <wp:docPr id="3" name="Picture 3"/>
             <wp:cNvGraphicFramePr>
               <a:graphicFrameLocks noChangeAspect="1"/>
@@ -1659,7 +2187,7 @@
                   <pic:spPr>
                     <a:xfrm>
                       <a:off x="0" y="0"/>
-                      <a:ext cx="5303520" cy="3535680"/>
+                      <a:ext cx="5120640" cy="3413760"/>
                     </a:xfrm>
                     <a:prstGeom prst="rect"/>
                   </pic:spPr>
@@ -1678,28 +2206,28 @@
         <w:rPr>
           <w:i/>
         </w:rPr>
-        <w:t>Figura 3: Gráfico de dispersión frente a la recta identidad y = x. Gradient Boosting exhibe una adherencia casi perfecta al eje ideal.</w:t>
+        <w:t>Figura 3: Comparación frente a la recta identidad y = x. Random Forest corrige la subestimación en productos caros.</w:t>
       </w:r>
     </w:p>
     <w:p>
       <w:pPr>
         <w:keepNext/>
-        <w:spacing w:before="200" w:after="80"/>
+        <w:spacing w:before="200" w:after="60"/>
       </w:pPr>
       <w:r>
         <w:rPr>
           <w:b/>
           <w:color w:val="006699"/>
-          <w:sz w:val="24"/>
+          <w:sz w:val="23"/>
         </w:rPr>
-        <w:t>6.4 Diagnóstico Comparativo de Residuos</w:t>
+        <w:t>6.4 Diagnóstico de Residuos</w:t>
       </w:r>
     </w:p>
     <w:p>
       <w:r>
         <w:drawing>
           <wp:inline xmlns:a="http://schemas.openxmlformats.org/drawingml/2006/main" xmlns:pic="http://schemas.openxmlformats.org/drawingml/2006/picture">
-            <wp:extent cx="5669280" cy="2267125"/>
+            <wp:extent cx="5486400" cy="2190021"/>
             <wp:docPr id="4" name="Picture 4"/>
             <wp:cNvGraphicFramePr>
               <a:graphicFrameLocks noChangeAspect="1"/>
@@ -1720,7 +2248,7 @@
                   <pic:spPr>
                     <a:xfrm>
                       <a:off x="0" y="0"/>
-                      <a:ext cx="5669280" cy="2267125"/>
+                      <a:ext cx="5486400" cy="2190021"/>
                     </a:xfrm>
                     <a:prstGeom prst="rect"/>
                   </pic:spPr>
@@ -1739,80 +2267,80 @@
         <w:rPr>
           <w:i/>
         </w:rPr>
-        <w:t>Figura 4: Análisis de residuos (dispersión y densidad). Se comprueba la estabilización de la heterocedasticidad y la compresión de la campana de residuos.</w:t>
+        <w:t>Figura 4: Residuos vs predichos e histograma de densidad. Se observa mayor concentración en torno al cero y colas más acotadas.</w:t>
       </w:r>
     </w:p>
     <w:p>
       <w:pPr>
         <w:keepNext/>
-        <w:spacing w:before="320" w:after="120"/>
+        <w:spacing w:before="280" w:after="80"/>
       </w:pPr>
       <w:r>
         <w:rPr>
           <w:b/>
           <w:color w:val="1B365D"/>
-          <w:sz w:val="28"/>
+          <w:sz w:val="26"/>
         </w:rPr>
-        <w:t>7. Respuestas a las Preguntas Guía de la Cátedra</w:t>
+        <w:t>7. Puesta en Producción e Inferencia Real</w:t>
       </w:r>
     </w:p>
     <w:p>
       <w:r>
-        <w:t>1. ¿Qué modelos se compararon? Se contrastó la Regresión Lineal Múltiple OLS frente a Ridge (L2), Lasso (L1), Random Forest Regressor y Gradient Boosting Regressor.</w:t>
+        <w:t>El pipeline ganador fue exportado en models/best_model.joblib. Mediante src/predict.py se validaron tres casos reales:</w:t>
         <w:br/>
-        <w:t>2. ¿Qué hiperparámetros se optimizaron? En Ridge/Lasso se ajustó alpha; en Random Forest se afinaron n_estimators, max_depth, min_samples_leaf y max_features; en Gradient Boosting se ajustaron learning_rate, max_depth, n_estimators y subsample.</w:t>
+        <w:t>• Turismo económico (175/65 R 14, BRAND_C): $3.870,80 INR</w:t>
         <w:br/>
-        <w:t>3. ¿Cómo se evitó la fuga de datos? Mediante ColumnTransformer integrado en Pipeline, recalculando imputación y escala dentro de cada pliegue de CV.</w:t>
+        <w:t>• Turismo estándar (225/50 R 17, BRAND_A): $7.123,11 INR</w:t>
         <w:br/>
-        <w:t>4. ¿Hubo mejora significativa? SÍ. Gradient Boosting redujo el RMSE en 38,14% y el MAE en 41,86%, llevando el R² a 0,9223.</w:t>
-        <w:br/>
-        <w:t>5. ¿Por qué los árboles superaron a los lineales? Porque el costo de neumáticos pesados presenta saltos discretos por capas estructurales que un hiperplano lineal continuo no puede ajustar.</w:t>
-        <w:br/>
-        <w:t>6. ¿Está listo para producción? Sí, el pipeline fue exportado a best_model.joblib y verificado con el script interactivo predict.py.</w:t>
+        <w:t>• Camión pesado (279.4 mm rodado 22.5, BRAND_D, ratio imputado): $24.186,33 INR</w:t>
       </w:r>
     </w:p>
     <w:p>
       <w:pPr>
         <w:keepNext/>
-        <w:spacing w:before="320" w:after="120"/>
+        <w:spacing w:before="280" w:after="80"/>
       </w:pPr>
       <w:r>
         <w:rPr>
           <w:b/>
           <w:color w:val="1B365D"/>
-          <w:sz w:val="28"/>
+          <w:sz w:val="26"/>
         </w:rPr>
-        <w:t>8. Puesta en Producción y Casos de Inferencia</w:t>
+        <w:t>8. Respuestas a las Preguntas Guía de la Cátedra</w:t>
       </w:r>
     </w:p>
     <w:p>
       <w:r>
-        <w:t>El modelo empaquetado resuelve cotizaciones en tiempo real mediante la interfaz de línea de comandos. Casos validados:</w:t>
+        <w:t>1. ¿Qué modelos se compararon? Regresión Lineal OLS, Ridge (L2) y Random Forest Regressor.</w:t>
         <w:br/>
-        <w:t>• Neumático Rodado 14 (175/65 R 14, BRAND_C): $2.842,50 INR</w:t>
+        <w:t>2. ¿Qué hiperparámetros se optimizaron? En Ridge se evaluó alpha; en Random Forest se optimizaron n_estimators, max_depth, min_samples_leaf y max_features.</w:t>
         <w:br/>
-        <w:t>• Neumático Rodado 17 (225/50 R 17, BRAND_A): $5.620,18 INR</w:t>
+        <w:t>3. ¿Cómo se evitó la fuga de datos? Con ColumnTransformer integrado en Pipeline, recalculando imputación y escala dentro de cada pliegue de entrenamiento.</w:t>
         <w:br/>
-        <w:t>• Neumático Rodado 22.5 Pesado (279.4 mm, BRAND_D, ratio imputado): $26.890,45 INR</w:t>
+        <w:t>4. ¿Por qué Ridge no mejoró sustancialmente? Porque la relación entre variables y costo presenta no linealidades que no se resuelven penalizando coeficientes lineales.</w:t>
+        <w:br/>
+        <w:t>5. ¿Hubo mejora significativa? Sí: Random Forest ganó en 5/5 pliegues en validación cruzada y en Test redujo el MAE un 25,94% y el RMSE un 12,54%, elevando el R² a 0,8446.</w:t>
+        <w:br/>
+        <w:t>6. ¿Está listo para producción? Sí, empaquetado en best_model.joblib con interfaz CLI ejecutable.</w:t>
       </w:r>
     </w:p>
     <w:p>
       <w:pPr>
         <w:keepNext/>
-        <w:spacing w:before="320" w:after="120"/>
+        <w:spacing w:before="280" w:after="80"/>
       </w:pPr>
       <w:r>
         <w:rPr>
           <w:b/>
           <w:color w:val="1B365D"/>
-          <w:sz w:val="28"/>
+          <w:sz w:val="26"/>
         </w:rPr>
         <w:t>9. Conclusiones</w:t>
       </w:r>
     </w:p>
     <w:p>
       <w:r>
-        <w:t>La Evidencia N.º 3 consolida el ciclo de vida de desarrollo de IA en el ISPC: desde el análisis exploratorio inicial y la línea de base lineal, hasta la optimización no lineal avanzada con rigor metodológico y despliegue para inferencia real.</w:t>
+        <w:t>La Evidencia N.º 3 consolida el flujo de machine learning del ISPC con un enfoque transparente, reproducible y sin fuga de datos, demostrando la superioridad de los ensambles no lineales sobre el catálogo de neumáticos.</w:t>
       </w:r>
     </w:p>
     <w:sectPr>

</xml_diff>